<commit_message>
Chart JS Demo 1.1.0: include the sample data snapshot
The app package now contains data-snapshot.zip with the five sample
rows, so the charts show data on the first run. Documentation updated.

Co-Authored-By: Claude Opus 5.5 (1M context) <noreply@anthropic.com>
</commit_message>
<xml_diff>
--- a/docs/Chart JS Sample 10.24.17.docx
+++ b/docs/Chart JS Sample 10.24.17.docx
@@ -203,7 +203,7 @@
                 <w:b/>
                 <w:bCs/>
               </w:rPr>
-              <w:t xml:space="preserve">1.0.0</w:t>
+              <w:t xml:space="preserve">1.1.0</w:t>
             </w:r>
             <w:r>
               <w:t xml:space="preserve"> (GitHub release </w:t>
@@ -213,7 +213,7 @@
                 <w:rFonts w:ascii="Consolas" w:cs="Consolas" w:eastAsia="Consolas" w:hAnsi="Consolas"/>
                 <w:color w:val="C7254E"/>
               </w:rPr>
-              <w:t xml:space="preserve">v1.0.0</w:t>
+              <w:t xml:space="preserve">v1.1.0</w:t>
             </w:r>
             <w:r>
               <w:t xml:space="preserve">)</w:t>
@@ -781,7 +781,7 @@
         <w:pStyle w:val="Heading1"/>
       </w:pPr>
       <w:r>
-        <w:t xml:space="preserve">2. What is new in the 10.24.17 version</w:t>
+        <w:t xml:space="preserve">2. What is new in version 1.1.0</w:t>
       </w:r>
     </w:p>
     <w:p>
@@ -794,7 +794,7 @@
         <w:spacing w:after="60"/>
       </w:pPr>
       <w:r>
-        <w:t xml:space="preserve">The app is converted from Studio Pro 10.24.6 to 10.24.17. The functionality is unchanged.</w:t>
+        <w:t xml:space="preserve">The package now contains the data snapshot with the five sample rows, so the charts show data on the first run. The 1.0.0 package for Studio Pro 10.24.17 did not contain it; there the charts stayed empty until rows were added.</w:t>
       </w:r>
     </w:p>
     <w:p>
@@ -807,7 +807,7 @@
         <w:spacing w:after="60"/>
       </w:pPr>
       <w:r>
-        <w:t xml:space="preserve">The model check reports 0 errors. It reports 22 warnings, which come from Atlas page templates, building blocks, menu items and a legacy drop-down; they do not stop the app.</w:t>
+        <w:t xml:space="preserve">New documentation, cover picture and screenshots.</w:t>
       </w:r>
     </w:p>
     <w:p>
@@ -820,7 +820,7 @@
         <w:spacing w:after="60"/>
       </w:pPr>
       <w:r>
-        <w:t xml:space="preserve">The converted app was started on the Mendix 10.24.17 runtime and the pages were opened in a browser. All seven charts are drawn, the click message appears and the browser console shows no errors. The screenshots in this document are from that run.</w:t>
+        <w:t xml:space="preserve">The app is converted from Studio Pro 10.24.6 to 10.24.17 (since 1.0.0). The functionality is unchanged.</w:t>
       </w:r>
     </w:p>
     <w:p>
@@ -833,25 +833,7 @@
         <w:spacing w:after="60"/>
       </w:pPr>
       <w:r>
-        <w:t xml:space="preserve">The package is published on GitHub as release </w:t>
-      </w:r>
-      <w:r>
-        <w:rPr>
-          <w:rFonts w:ascii="Consolas" w:cs="Consolas" w:eastAsia="Consolas" w:hAnsi="Consolas"/>
-          <w:color w:val="C7254E"/>
-        </w:rPr>
-        <w:t xml:space="preserve">v1.0.0</w:t>
-      </w:r>
-      <w:r>
-        <w:t xml:space="preserve">.</w:t>
-      </w:r>
-    </w:p>
-    <w:p>
-      <w:pPr>
-        <w:pStyle w:val="Heading1"/>
-      </w:pPr>
-      <w:r>
-        <w:t xml:space="preserve">3. Requirements</w:t>
+        <w:t xml:space="preserve">The model check reports 0 errors. It reports 22 warnings, which come from Atlas page templates, building blocks, menu items and a legacy drop-down; they do not stop the app.</w:t>
       </w:r>
     </w:p>
     <w:p>
@@ -864,17 +846,7 @@
         <w:spacing w:after="60"/>
       </w:pPr>
       <w:r>
-        <w:t xml:space="preserve">Mendix Studio Pro </w:t>
-      </w:r>
-      <w:r>
-        <w:rPr>
-          <w:b/>
-          <w:bCs/>
-        </w:rPr>
-        <w:t xml:space="preserve">10.24.17</w:t>
-      </w:r>
-      <w:r>
-        <w:t xml:space="preserve"> or a later 10.24 version.</w:t>
+        <w:t xml:space="preserve">The converted app was started on the Mendix 10.24.17 runtime and the pages were opened in a browser. All seven charts are drawn, the click message appears and the browser console shows no errors. The screenshots in this document are from that run.</w:t>
       </w:r>
     </w:p>
     <w:p>
@@ -887,7 +859,25 @@
         <w:spacing w:after="60"/>
       </w:pPr>
       <w:r>
-        <w:t xml:space="preserve">A web browser. The sample has a web profile only.</w:t>
+        <w:t xml:space="preserve">The package is published on GitHub as release </w:t>
+      </w:r>
+      <w:r>
+        <w:rPr>
+          <w:rFonts w:ascii="Consolas" w:cs="Consolas" w:eastAsia="Consolas" w:hAnsi="Consolas"/>
+          <w:color w:val="C7254E"/>
+        </w:rPr>
+        <w:t xml:space="preserve">v1.1.0</w:t>
+      </w:r>
+      <w:r>
+        <w:t xml:space="preserve">.</w:t>
+      </w:r>
+    </w:p>
+    <w:p>
+      <w:pPr>
+        <w:pStyle w:val="Heading1"/>
+      </w:pPr>
+      <w:r>
+        <w:t xml:space="preserve">3. Requirements</w:t>
       </w:r>
     </w:p>
     <w:p>
@@ -900,6 +890,42 @@
         <w:spacing w:after="60"/>
       </w:pPr>
       <w:r>
+        <w:t xml:space="preserve">Mendix Studio Pro </w:t>
+      </w:r>
+      <w:r>
+        <w:rPr>
+          <w:b/>
+          <w:bCs/>
+        </w:rPr>
+        <w:t xml:space="preserve">10.24.17</w:t>
+      </w:r>
+      <w:r>
+        <w:t xml:space="preserve"> or a later 10.24 version.</w:t>
+      </w:r>
+    </w:p>
+    <w:p>
+      <w:pPr>
+        <w:pStyle w:val="ListParagraph"/>
+        <w:numPr>
+          <w:ilvl w:val="0"/>
+          <w:numId w:val="2"/>
+        </w:numPr>
+        <w:spacing w:after="60"/>
+      </w:pPr>
+      <w:r>
+        <w:t xml:space="preserve">A web browser. The sample has a web profile only.</w:t>
+      </w:r>
+    </w:p>
+    <w:p>
+      <w:pPr>
+        <w:pStyle w:val="ListParagraph"/>
+        <w:numPr>
+          <w:ilvl w:val="0"/>
+          <w:numId w:val="2"/>
+        </w:numPr>
+        <w:spacing w:after="60"/>
+      </w:pPr>
+      <w:r>
         <w:t xml:space="preserve">No login is needed. App security is switched off in the sample.</w:t>
       </w:r>
     </w:p>
@@ -976,7 +1002,7 @@
           <w:b/>
           <w:bCs/>
         </w:rPr>
-        <w:t xml:space="preserve">v1.0.0</w:t>
+        <w:t xml:space="preserve">v1.1.0</w:t>
       </w:r>
       <w:r>
         <w:t xml:space="preserve">.</w:t>
@@ -1059,7 +1085,7 @@
         <w:spacing w:after="120"/>
       </w:pPr>
       <w:r>
-        <w:t xml:space="preserve">The package contains a data snapshot with five sample rows, so the charts show data on the first run.</w:t>
+        <w:t xml:space="preserve">The package contains a data snapshot with five sample rows, so the charts show data on the first run. If Studio Pro asks to synchronize the database when you run the app, confirm.</w:t>
       </w:r>
     </w:p>
     <w:p>
@@ -1092,7 +1118,7 @@
       <w:pPr>
         <w:spacing w:after="120"/>
       </w:pPr>
-      <w:hyperlink w:history="1" r:id="rIdcnjx8-93_vphe0ehxiqzw">
+      <w:hyperlink w:history="1" r:id="rIdms16b6icqkludorko104b">
         <w:r>
           <w:rPr>
             <w:rStyle w:val="Hyperlink"/>
@@ -5319,7 +5345,7 @@
       <w:pPr>
         <w:spacing w:after="120"/>
       </w:pPr>
-      <w:hyperlink w:history="1" r:id="rIdqhtvzxwwb8reugaww5c_e">
+      <w:hyperlink w:history="1" r:id="rIdg8dvtno8ybs5i2vpyztp9">
         <w:r>
           <w:rPr>
             <w:rStyle w:val="Hyperlink"/>
@@ -5340,7 +5366,7 @@
       <w:pPr>
         <w:spacing w:after="120"/>
       </w:pPr>
-      <w:hyperlink w:history="1" r:id="rIdoqmxrfr-y412-tbzf5kg7">
+      <w:hyperlink w:history="1" r:id="rIdjqxw9h_kt1n8vk4ypv_e3">
         <w:r>
           <w:rPr>
             <w:rStyle w:val="Hyperlink"/>
@@ -5506,6 +5532,99 @@
           </w:tcPr>
           <w:p>
             <w:r>
+              <w:t xml:space="preserve">1.1.0</w:t>
+            </w:r>
+          </w:p>
+        </w:tc>
+        <w:tc>
+          <w:tcPr>
+            <w:tcW w:type="dxa" w:w="1300"/>
+            <w:tcBorders>
+              <w:top w:val="single" w:color="BFBFBF" w:sz="4"/>
+              <w:left w:val="single" w:color="BFBFBF" w:sz="4"/>
+              <w:bottom w:val="single" w:color="BFBFBF" w:sz="4"/>
+              <w:right w:val="single" w:color="BFBFBF" w:sz="4"/>
+            </w:tcBorders>
+            <w:tcMar>
+              <w:top w:type="dxa" w:w="60"/>
+              <w:left w:type="dxa" w:w="100"/>
+              <w:bottom w:type="dxa" w:w="60"/>
+              <w:right w:type="dxa" w:w="100"/>
+            </w:tcMar>
+          </w:tcPr>
+          <w:p>
+            <w:r>
+              <w:t xml:space="preserve">10.24.17</w:t>
+            </w:r>
+          </w:p>
+        </w:tc>
+        <w:tc>
+          <w:tcPr>
+            <w:tcW w:type="dxa" w:w="1600"/>
+            <w:tcBorders>
+              <w:top w:val="single" w:color="BFBFBF" w:sz="4"/>
+              <w:left w:val="single" w:color="BFBFBF" w:sz="4"/>
+              <w:bottom w:val="single" w:color="BFBFBF" w:sz="4"/>
+              <w:right w:val="single" w:color="BFBFBF" w:sz="4"/>
+            </w:tcBorders>
+            <w:tcMar>
+              <w:top w:type="dxa" w:w="60"/>
+              <w:left w:type="dxa" w:w="100"/>
+              <w:bottom w:type="dxa" w:w="60"/>
+              <w:right w:type="dxa" w:w="100"/>
+            </w:tcMar>
+          </w:tcPr>
+          <w:p>
+            <w:r>
+              <w:t xml:space="preserve">v1.1.0</w:t>
+            </w:r>
+          </w:p>
+        </w:tc>
+        <w:tc>
+          <w:tcPr>
+            <w:tcW w:type="dxa" w:w="5638"/>
+            <w:tcBorders>
+              <w:top w:val="single" w:color="BFBFBF" w:sz="4"/>
+              <w:left w:val="single" w:color="BFBFBF" w:sz="4"/>
+              <w:bottom w:val="single" w:color="BFBFBF" w:sz="4"/>
+              <w:right w:val="single" w:color="BFBFBF" w:sz="4"/>
+            </w:tcBorders>
+            <w:tcMar>
+              <w:top w:type="dxa" w:w="60"/>
+              <w:left w:type="dxa" w:w="100"/>
+              <w:bottom w:type="dxa" w:w="60"/>
+              <w:right w:type="dxa" w:w="100"/>
+            </w:tcMar>
+          </w:tcPr>
+          <w:p>
+            <w:r>
+              <w:t xml:space="preserve">Data snapshot with the sample rows included in the package; runtime and browser check; new documentation, cover and screenshots.</w:t>
+            </w:r>
+          </w:p>
+        </w:tc>
+      </w:tr>
+      <w:tr>
+        <w:trPr>
+          <w:cantSplit/>
+        </w:trPr>
+        <w:tc>
+          <w:tcPr>
+            <w:tcW w:type="dxa" w:w="1100"/>
+            <w:tcBorders>
+              <w:top w:val="single" w:color="BFBFBF" w:sz="4"/>
+              <w:left w:val="single" w:color="BFBFBF" w:sz="4"/>
+              <w:bottom w:val="single" w:color="BFBFBF" w:sz="4"/>
+              <w:right w:val="single" w:color="BFBFBF" w:sz="4"/>
+            </w:tcBorders>
+            <w:tcMar>
+              <w:top w:type="dxa" w:w="60"/>
+              <w:left w:type="dxa" w:w="100"/>
+              <w:bottom w:type="dxa" w:w="60"/>
+              <w:right w:type="dxa" w:w="100"/>
+            </w:tcMar>
+          </w:tcPr>
+          <w:p>
+            <w:r>
               <w:t xml:space="preserve">1.0.0</w:t>
             </w:r>
           </w:p>
@@ -5572,7 +5691,7 @@
           </w:tcPr>
           <w:p>
             <w:r>
-              <w:t xml:space="preserve">Converted to Studio Pro 10.24.17; runtime and browser check; new documentation, cover and screenshots.</w:t>
+              <w:t xml:space="preserve">Converted to Studio Pro 10.24.17. Package without the data snapshot.</w:t>
             </w:r>
           </w:p>
         </w:tc>
@@ -5817,7 +5936,7 @@
         <w:sz w:val="16"/>
         <w:szCs w:val="16"/>
       </w:rPr>
-      <w:t xml:space="preserve">Chart JS Sample 1.0.0 · Mendix 10.24.17</w:t>
+      <w:t xml:space="preserve">Chart JS Sample 1.1.0 · Mendix 10.24.17</w:t>
     </w:r>
   </w:p>
 </w:hdr>

</xml_diff>